<commit_message>
Add page numbers to slides and worksheet
</commit_message>
<xml_diff>
--- a/worksheet/Secure-AI-Workshop-worksheet.docx
+++ b/worksheet/Secure-AI-Workshop-worksheet.docx
@@ -2058,6 +2058,7 @@
       </w:r>
     </w:p>
     <w:sectPr>
+      <w:footerReference w:type="default" r:id="rId9"/>
       <w:pgSz w:w="12240" w:h="15840"/>
       <w:pgMar w:top="1008" w:right="1152" w:bottom="864" w:left="1152" w:header="720" w:footer="720" w:gutter="0"/>
       <w:cols w:space="720"/>
@@ -2065,6 +2066,69 @@
     </w:sectPr>
   </w:body>
 </w:document>
+</file>
+
+<file path=word/footer1.xml><?xml version="1.0" encoding="utf-8"?>
+<w:ftr xmlns:m="http://schemas.openxmlformats.org/officeDocument/2006/math" xmlns:mc="http://schemas.openxmlformats.org/markup-compatibility/2006" xmlns:mo="http://schemas.microsoft.com/office/mac/office/2008/main" xmlns:mv="urn:schemas-microsoft-com:mac:vml" xmlns:o="urn:schemas-microsoft-com:office:office" xmlns:r="http://schemas.openxmlformats.org/officeDocument/2006/relationships" xmlns:v="urn:schemas-microsoft-com:vml" xmlns:w10="urn:schemas-microsoft-com:office:word" xmlns:w14="http://schemas.microsoft.com/office/word/2010/wordml" xmlns:w="http://schemas.openxmlformats.org/wordprocessingml/2006/main" xmlns:wne="http://schemas.microsoft.com/office/word/2006/wordml" xmlns:wp14="http://schemas.microsoft.com/office/word/2010/wordprocessingDrawing" xmlns:wp="http://schemas.openxmlformats.org/drawingml/2006/wordprocessingDrawing" xmlns:wpc="http://schemas.microsoft.com/office/word/2010/wordprocessingCanvas" xmlns:wpg="http://schemas.microsoft.com/office/word/2010/wordprocessingGroup" xmlns:wpi="http://schemas.microsoft.com/office/word/2010/wordprocessingInk" xmlns:wps="http://schemas.microsoft.com/office/word/2010/wordprocessingShape" mc:Ignorable="w14 wp14">
+  <w:p>
+    <w:pPr>
+      <w:pStyle w:val="Footer"/>
+      <w:jc w:val="center"/>
+    </w:pPr>
+    <w:r>
+      <w:rPr>
+        <w:rFonts w:ascii="Calibri" w:hAnsi="Calibri"/>
+        <w:b w:val="0"/>
+        <w:i w:val="0"/>
+        <w:color w:val="6E7A6B"/>
+        <w:sz w:val="16"/>
+      </w:rPr>
+      <w:t>Secure AI Workshop · Worksheet</w:t>
+    </w:r>
+    <w:r>
+      <w:rPr>
+        <w:rFonts w:ascii="Calibri" w:hAnsi="Calibri"/>
+        <w:b w:val="0"/>
+        <w:i w:val="0"/>
+        <w:color w:val="6E7A6B"/>
+        <w:sz w:val="16"/>
+      </w:rPr>
+      <w:t xml:space="preserve">      Page </w:t>
+    </w:r>
+    <w:r>
+      <w:rPr>
+        <w:rFonts w:ascii="Calibri" w:hAnsi="Calibri"/>
+        <w:color w:val="6E7A6B"/>
+        <w:sz w:val="16"/>
+      </w:rPr>
+      <w:fldChar w:fldCharType="begin"/>
+      <w:instrText xml:space="preserve">PAGE</w:instrText>
+      <w:fldChar w:fldCharType="separate"/>
+      <w:fldChar w:fldCharType="end"/>
+    </w:r>
+    <w:r>
+      <w:rPr>
+        <w:rFonts w:ascii="Calibri" w:hAnsi="Calibri"/>
+        <w:b w:val="0"/>
+        <w:i w:val="0"/>
+        <w:color w:val="6E7A6B"/>
+        <w:sz w:val="16"/>
+      </w:rPr>
+      <w:t xml:space="preserve"> of </w:t>
+    </w:r>
+    <w:r>
+      <w:rPr>
+        <w:rFonts w:ascii="Calibri" w:hAnsi="Calibri"/>
+        <w:color w:val="6E7A6B"/>
+        <w:sz w:val="16"/>
+      </w:rPr>
+      <w:fldChar w:fldCharType="begin"/>
+      <w:instrText xml:space="preserve">NUMPAGES</w:instrText>
+      <w:fldChar w:fldCharType="separate"/>
+      <w:fldChar w:fldCharType="end"/>
+    </w:r>
+  </w:p>
+</w:ftr>
 </file>
 
 <file path=word/numbering.xml><?xml version="1.0" encoding="utf-8"?>

</xml_diff>

<commit_message>
Clarify the 70% threshold is an illustrative, tunable default
Add a note to slide 16, the worksheet (Step 3), and notebook 03 so
participants know 70% is not a fixed standard (and not from the paper).
</commit_message>
<xml_diff>
--- a/worksheet/Secure-AI-Workshop-worksheet.docx
+++ b/worksheet/Secure-AI-Workshop-worksheet.docx
@@ -942,6 +942,31 @@
           <w:sz w:val="19"/>
         </w:rPr>
         <w:t xml:space="preserve">      10 min</w:t>
+      </w:r>
+    </w:p>
+    <w:p>
+      <w:pPr>
+        <w:spacing w:before="0" w:after="120" w:line="254" w:lineRule="auto"/>
+      </w:pPr>
+      <w:r>
+        <w:rPr>
+          <w:rFonts w:ascii="Calibri" w:hAnsi="Calibri"/>
+          <w:b/>
+          <w:i w:val="0"/>
+          <w:color w:val="9A7327"/>
+          <w:sz w:val="19"/>
+        </w:rPr>
+        <w:t xml:space="preserve">Note.  </w:t>
+      </w:r>
+      <w:r>
+        <w:rPr>
+          <w:rFonts w:ascii="Calibri" w:hAnsi="Calibri"/>
+          <w:b w:val="0"/>
+          <w:i/>
+          <w:color w:val="6E7A6B"/>
+          <w:sz w:val="19"/>
+        </w:rPr>
+        <w:t>The 70% threshold (and the 62% example) is an illustrative default, not a fixed standard — calibrate it per task on your own data. What matters is the principle: route uncertain outputs to a human.</w:t>
       </w:r>
     </w:p>
     <w:tbl>

</xml_diff>